<commit_message>
Update clients/grand_servis/analitika_GRAND_SERVIS.docx - corrected savings
</commit_message>
<xml_diff>
--- a/clients/grand_servis/analitika_GRAND_SERVIS.docx
+++ b/clients/grand_servis/analitika_GRAND_SERVIS.docx
@@ -84,7 +84,7 @@
           <w:color w:val="666666"/>
           <w:sz w:val="16"/>
         </w:rPr>
-        <w:t>Источники: audit-it.ru, zachestnyibiznes.ru · 09.07.2026</w:t>
+        <w:t>Источники: audit-it.ru · 09.07.2026</w:t>
       </w:r>
     </w:p>
     <w:p>
@@ -94,7 +94,7 @@
           <w:color w:val="2D2D2D"/>
           <w:sz w:val="22"/>
         </w:rPr>
-        <w:t>1. Основные реквизиты компании</w:t>
+        <w:t>1. Основные реквизиты</w:t>
       </w:r>
     </w:p>
     <w:tbl>
@@ -110,7 +110,7 @@
       <w:tr>
         <w:tc>
           <w:tcPr>
-            <w:tcW w:type="dxa" w:w="3168"/>
+            <w:tcW w:type="dxa" w:w="4320"/>
           </w:tcPr>
           <w:p>
             <w:r>
@@ -124,7 +124,7 @@
         </w:tc>
         <w:tc>
           <w:tcPr>
-            <w:tcW w:type="dxa" w:w="5760"/>
+            <w:tcW w:type="dxa" w:w="4320"/>
           </w:tcPr>
           <w:p>
             <w:r>
@@ -139,7 +139,7 @@
       <w:tr>
         <w:tc>
           <w:tcPr>
-            <w:tcW w:type="dxa" w:w="3168"/>
+            <w:tcW w:type="dxa" w:w="4320"/>
             <w:shd w:val="clear" w:color="auto" w:fill="F5F5F5"/>
           </w:tcPr>
           <w:p>
@@ -154,7 +154,7 @@
         </w:tc>
         <w:tc>
           <w:tcPr>
-            <w:tcW w:type="dxa" w:w="5760"/>
+            <w:tcW w:type="dxa" w:w="4320"/>
             <w:shd w:val="clear" w:color="auto" w:fill="F5F5F5"/>
           </w:tcPr>
           <w:p>
@@ -170,7 +170,7 @@
       <w:tr>
         <w:tc>
           <w:tcPr>
-            <w:tcW w:type="dxa" w:w="3168"/>
+            <w:tcW w:type="dxa" w:w="4320"/>
           </w:tcPr>
           <w:p>
             <w:r>
@@ -184,7 +184,7 @@
         </w:tc>
         <w:tc>
           <w:tcPr>
-            <w:tcW w:type="dxa" w:w="5760"/>
+            <w:tcW w:type="dxa" w:w="4320"/>
           </w:tcPr>
           <w:p>
             <w:r>
@@ -199,7 +199,7 @@
       <w:tr>
         <w:tc>
           <w:tcPr>
-            <w:tcW w:type="dxa" w:w="3168"/>
+            <w:tcW w:type="dxa" w:w="4320"/>
             <w:shd w:val="clear" w:color="auto" w:fill="F5F5F5"/>
           </w:tcPr>
           <w:p>
@@ -214,7 +214,7 @@
         </w:tc>
         <w:tc>
           <w:tcPr>
-            <w:tcW w:type="dxa" w:w="5760"/>
+            <w:tcW w:type="dxa" w:w="4320"/>
             <w:shd w:val="clear" w:color="auto" w:fill="F5F5F5"/>
           </w:tcPr>
           <w:p>
@@ -230,7 +230,7 @@
       <w:tr>
         <w:tc>
           <w:tcPr>
-            <w:tcW w:type="dxa" w:w="3168"/>
+            <w:tcW w:type="dxa" w:w="4320"/>
           </w:tcPr>
           <w:p>
             <w:r>
@@ -244,7 +244,7 @@
         </w:tc>
         <w:tc>
           <w:tcPr>
-            <w:tcW w:type="dxa" w:w="5760"/>
+            <w:tcW w:type="dxa" w:w="4320"/>
           </w:tcPr>
           <w:p>
             <w:r>
@@ -259,7 +259,7 @@
       <w:tr>
         <w:tc>
           <w:tcPr>
-            <w:tcW w:type="dxa" w:w="3168"/>
+            <w:tcW w:type="dxa" w:w="4320"/>
             <w:shd w:val="clear" w:color="auto" w:fill="F5F5F5"/>
           </w:tcPr>
           <w:p>
@@ -268,13 +268,13 @@
                 <w:color w:val="555555"/>
                 <w:sz w:val="18"/>
               </w:rPr>
-              <w:t>Основной вид деятельности (ОКВЭД)</w:t>
+              <w:t>ОКВЭД</w:t>
             </w:r>
           </w:p>
         </w:tc>
         <w:tc>
           <w:tcPr>
-            <w:tcW w:type="dxa" w:w="5760"/>
+            <w:tcW w:type="dxa" w:w="4320"/>
             <w:shd w:val="clear" w:color="auto" w:fill="F5F5F5"/>
           </w:tcPr>
           <w:p>
@@ -290,7 +290,7 @@
       <w:tr>
         <w:tc>
           <w:tcPr>
-            <w:tcW w:type="dxa" w:w="3168"/>
+            <w:tcW w:type="dxa" w:w="4320"/>
           </w:tcPr>
           <w:p>
             <w:r>
@@ -304,14 +304,14 @@
         </w:tc>
         <w:tc>
           <w:tcPr>
-            <w:tcW w:type="dxa" w:w="5760"/>
+            <w:tcW w:type="dxa" w:w="4320"/>
           </w:tcPr>
           <w:p>
             <w:r>
               <w:rPr>
                 <w:sz w:val="18"/>
               </w:rPr>
-              <w:t>ОСН (ЕСХН?)</w:t>
+              <w:t>ОСН/ЕСХН</w:t>
             </w:r>
           </w:p>
         </w:tc>
@@ -319,7 +319,7 @@
       <w:tr>
         <w:tc>
           <w:tcPr>
-            <w:tcW w:type="dxa" w:w="3168"/>
+            <w:tcW w:type="dxa" w:w="4320"/>
             <w:shd w:val="clear" w:color="auto" w:fill="F5F5F5"/>
           </w:tcPr>
           <w:p>
@@ -334,7 +334,7 @@
         </w:tc>
         <w:tc>
           <w:tcPr>
-            <w:tcW w:type="dxa" w:w="5760"/>
+            <w:tcW w:type="dxa" w:w="4320"/>
             <w:shd w:val="clear" w:color="auto" w:fill="F5F5F5"/>
           </w:tcPr>
           <w:p>
@@ -363,7 +363,7 @@
         <w:rPr>
           <w:sz w:val="20"/>
         </w:rPr>
-        <w:t>Таблица 1. Динамика выручки</w:t>
+        <w:t>Динамика выручки:</w:t>
       </w:r>
     </w:p>
     <w:tbl>
@@ -448,7 +448,7 @@
           <w:color w:val="2D2D2D"/>
           <w:sz w:val="22"/>
         </w:rPr>
-        <w:t>3. Расчёт налоговой экономии при статусе резидента Сколково</w:t>
+        <w:t>3. Расчёт налоговой экономии</w:t>
       </w:r>
     </w:p>
     <w:p>
@@ -464,7 +464,7 @@
         <w:rPr>
           <w:sz w:val="20"/>
         </w:rPr>
-        <w:t>• Налог на прибыль — 0% (стандартная ставка 20%)</w:t>
+        <w:t>• Налог на прибыль / УСН — 0% на 10 лет</w:t>
       </w:r>
     </w:p>
     <w:p>
@@ -563,7 +563,7 @@
                 <w:color w:val="FFFFFF"/>
                 <w:sz w:val="18"/>
               </w:rPr>
-              <w:t>Экономия в год</w:t>
+              <w:t>Экономия</w:t>
             </w:r>
           </w:p>
         </w:tc>
@@ -579,7 +579,7 @@
               <w:rPr>
                 <w:sz w:val="18"/>
               </w:rPr>
-              <w:t>Налог на прибыль</w:t>
+              <w:t>Налог на прибыль / УСН</w:t>
             </w:r>
           </w:p>
         </w:tc>
@@ -593,7 +593,7 @@
               <w:rPr>
                 <w:sz w:val="18"/>
               </w:rPr>
-              <w:t>0 руб.</w:t>
+              <w:t>0 руб./год</w:t>
             </w:r>
           </w:p>
         </w:tc>
@@ -607,7 +607,7 @@
               <w:rPr>
                 <w:sz w:val="18"/>
               </w:rPr>
-              <w:t>0 руб.</w:t>
+              <w:t>0 руб./год</w:t>
             </w:r>
           </w:p>
         </w:tc>
@@ -621,7 +621,7 @@
               <w:rPr>
                 <w:sz w:val="18"/>
               </w:rPr>
-              <w:t>0 руб.</w:t>
+              <w:t>0 руб./год</w:t>
             </w:r>
           </w:p>
         </w:tc>
@@ -649,7 +649,7 @@
               <w:rPr>
                 <w:sz w:val="18"/>
               </w:rPr>
-              <w:t>900 000 руб.</w:t>
+              <w:t>300 000 руб./год (оценка)</w:t>
             </w:r>
           </w:p>
         </w:tc>
@@ -662,7 +662,7 @@
               <w:rPr>
                 <w:sz w:val="18"/>
               </w:rPr>
-              <w:t>450 000 руб.</w:t>
+              <w:t>—</w:t>
             </w:r>
           </w:p>
         </w:tc>
@@ -675,7 +675,7 @@
               <w:rPr>
                 <w:sz w:val="18"/>
               </w:rPr>
-              <w:t>450 000 руб.</w:t>
+              <w:t>300 000 руб./год</w:t>
             </w:r>
           </w:p>
         </w:tc>
@@ -705,7 +705,7 @@
               <w:rPr>
                 <w:sz w:val="18"/>
               </w:rPr>
-              <w:t>≈ 100 000 руб.</w:t>
+              <w:t>≈ 80 000 руб./год (оценка)</w:t>
             </w:r>
           </w:p>
         </w:tc>
@@ -719,7 +719,7 @@
               <w:rPr>
                 <w:sz w:val="18"/>
               </w:rPr>
-              <w:t>0 руб.</w:t>
+              <w:t>0 руб./год</w:t>
             </w:r>
           </w:p>
         </w:tc>
@@ -733,7 +733,7 @@
               <w:rPr>
                 <w:sz w:val="18"/>
               </w:rPr>
-              <w:t>≈ 100 000 руб.</w:t>
+              <w:t>≈ 80 000 руб./год</w:t>
             </w:r>
           </w:p>
         </w:tc>
@@ -748,7 +748,7 @@
               <w:rPr>
                 <w:sz w:val="18"/>
               </w:rPr>
-              <w:t>ИТОГО</w:t>
+              <w:t>ИТОГО за 10 лет</w:t>
             </w:r>
           </w:p>
         </w:tc>
@@ -785,7 +785,7 @@
               <w:rPr>
                 <w:sz w:val="18"/>
               </w:rPr>
-              <w:t>550 000 руб.</w:t>
+              <w:t>3 млн руб.</w:t>
             </w:r>
           </w:p>
         </w:tc>
@@ -803,7 +803,7 @@
         <w:rPr>
           <w:sz w:val="20"/>
         </w:rPr>
-        <w:t>Прогноз экономии за 10 лет: 0–1 млн руб.</w:t>
+        <w:t>Прогноз минимальной экономии за 10 лет: 3 млн руб.</w:t>
       </w:r>
     </w:p>
     <w:p>
@@ -821,7 +821,7 @@
         <w:rPr>
           <w:sz w:val="20"/>
         </w:rPr>
-        <w:t>Компания занимается выращиванием зерновых культур.</w:t>
+        <w:t>Компания занимается выращиванием зерновых и масличных культур.</w:t>
       </w:r>
     </w:p>
     <w:p>
@@ -847,7 +847,7 @@
       <w:tr>
         <w:tc>
           <w:tcPr>
-            <w:tcW w:type="dxa" w:w="3168"/>
+            <w:tcW w:type="dxa" w:w="4320"/>
           </w:tcPr>
           <w:p>
             <w:r>
@@ -861,7 +861,7 @@
         </w:tc>
         <w:tc>
           <w:tcPr>
-            <w:tcW w:type="dxa" w:w="5760"/>
+            <w:tcW w:type="dxa" w:w="4320"/>
           </w:tcPr>
           <w:p>
             <w:r>
@@ -876,7 +876,7 @@
       <w:tr>
         <w:tc>
           <w:tcPr>
-            <w:tcW w:type="dxa" w:w="3168"/>
+            <w:tcW w:type="dxa" w:w="4320"/>
             <w:shd w:val="clear" w:color="auto" w:fill="F5F5F5"/>
           </w:tcPr>
           <w:p>
@@ -891,7 +891,7 @@
         </w:tc>
         <w:tc>
           <w:tcPr>
-            <w:tcW w:type="dxa" w:w="5760"/>
+            <w:tcW w:type="dxa" w:w="4320"/>
             <w:shd w:val="clear" w:color="auto" w:fill="F5F5F5"/>
           </w:tcPr>
           <w:p>
@@ -907,7 +907,7 @@
       <w:tr>
         <w:tc>
           <w:tcPr>
-            <w:tcW w:type="dxa" w:w="3168"/>
+            <w:tcW w:type="dxa" w:w="4320"/>
           </w:tcPr>
           <w:p>
             <w:r>
@@ -921,7 +921,7 @@
         </w:tc>
         <w:tc>
           <w:tcPr>
-            <w:tcW w:type="dxa" w:w="5760"/>
+            <w:tcW w:type="dxa" w:w="4320"/>
           </w:tcPr>
           <w:p>
             <w:r>
@@ -939,7 +939,7 @@
         <w:rPr>
           <w:sz w:val="20"/>
         </w:rPr>
-        <w:t>Рекомендация: В рамках подготовки заявки рекомендуется подача заявки на полезную модель.</w:t>
+        <w:t>Рекомендация: подача заявки на полезную модель в рамках подготовки.</w:t>
       </w:r>
     </w:p>
     <w:p>
@@ -975,7 +975,7 @@
         <w:rPr>
           <w:sz w:val="20"/>
         </w:rPr>
-        <w:t>1. Заключение договора на сопровождение заявки</w:t>
+        <w:t>1. Заключение договора</w:t>
       </w:r>
     </w:p>
     <w:p>
@@ -991,7 +991,7 @@
         <w:rPr>
           <w:sz w:val="20"/>
         </w:rPr>
-        <w:t>3. Подготовка и подача заявки в Фонд «Сколково»</w:t>
+        <w:t>3. Подготовка и подача заявки в Сколково</w:t>
       </w:r>
     </w:p>
     <w:p>
@@ -999,7 +999,7 @@
         <w:rPr>
           <w:sz w:val="20"/>
         </w:rPr>
-        <w:t>4. Получение статуса Участника проекта (4–6 мес.)</w:t>
+        <w:t>4. Получение статуса участника</w:t>
       </w:r>
     </w:p>
     <w:p>
@@ -1022,7 +1022,7 @@
         <w:rPr>
           <w:sz w:val="20"/>
         </w:rPr>
-        <w:t>ВЫВОД: Компания требует дополнительного анализа для оценки соответствия критериям Сколково.</w:t>
+        <w:t>ВЫВОД: Минимальная налоговая экономия за 10 лет — 3 млн руб..</w:t>
       </w:r>
     </w:p>
     <w:sectPr>

</xml_diff>